<commit_message>
editing chapter 3 report
</commit_message>
<xml_diff>
--- a/Report Draft/Chapter3-Methodology-COMPLETE.docx
+++ b/Report Draft/Chapter3-Methodology-COMPLETE.docx
@@ -802,7 +802,7 @@
           <w:sz w:val="18"/>
           <w:szCs w:val="18"/>
         </w:rPr>
-        <w:t xml:space="preserve">Figure 3.1. The forecasting pipeline. Solid arrows carry data; the dashed arrow carries the regime signal, estimated on the training window only.</w:t>
+        <w:t>Figure 3.1. The forecasting pipeline. Solid arrows carry data; the dashed arrow carries the regime signal, estimated on the training window only. The bracket marks the stages produced on the anchored walk-forward; each estimation box states its own refit cadence, which differs by model family for the reasons given in Section 3.6.</w:t>
       </w:r>
     </w:p>
     <w:p>
@@ -6039,7 +6039,49 @@
           <w:sz w:val="22"/>
           <w:szCs w:val="22"/>
         </w:rPr>
-        <w:t xml:space="preserve">The data are split by time into three contiguous blocks — training, validation and test — not by random folds. Cross-validation assumes exchangeable observations; volatility is strongly autocorrelated, so a randomly held-out day sits between two the model has seen and is predictable from them alone. The validation block carries every selection decision; the test block is touched once. Over it the models are re-estimated on an anchored walk-forward, the training window growing from the start of the sample, which beats a fixed-length rolling window because volatility regimes recur and discarding an early crisis would leave the model with no instance of the behaviour it most needs to have seen.</w:t>
+        <w:t>The data are split by time into three contiguous blocks — training, validation and test — not by random folds. Cross-validation assumes exchangeable observations; volatility is strongly autocorrelated, so a randomly held-out day sits between two the model has seen and is predictable from them alone. The validation block carries every selection decision; the test block is touched once. Over it the forecasts are produced on an anchored walk-forward, the estimation window growing from the start of the sample, which beats a fixed-length rolling window because volatility regimes recur and discarding an early crisis would leave a model with no instance of the behaviour it most needs to have seen.</w:t>
+      </w:r>
+    </w:p>
+    <w:p>
+      <w:pPr>
+        <w:spacing w:after="160" w:line="320" w:lineRule="auto"/>
+        <w:jc w:val="both"/>
+      </w:pPr>
+      <w:r>
+        <w:rPr>
+          <w:rFonts w:ascii="Calibri" w:hAnsi="Calibri" w:cs="Calibri" w:eastAsia="Calibri"/>
+          <w:color w:val="111111"/>
+          <w:sz w:val="22"/>
+        </w:rPr>
+        <w:t>What that walk-forward re-estimates is not the same for every model, and the difference is a design decision rather than an oversight. The econometric baselines are refitted on the expanding window at a fixed cadence, monthly here: they carry a handful of parameters, estimate in a fraction of a second, and withholding recent data from a model that costs nothing to update would be indefensible. The networks are estimated once, on all data preceding the test block, and held fixed across it. Refitting a network at every origin would confound two movements the study needs to keep apart — the forecast changing because the model has seen more data, and the forecast changing because a stochastic optimiser has landed somewhere else. With a single seed the second is not measurable, so a refitted network's month-to-month variation could not be attributed to either.</w:t>
+      </w:r>
+    </w:p>
+    <w:p>
+      <w:pPr>
+        <w:spacing w:after="160" w:line="320" w:lineRule="auto"/>
+        <w:jc w:val="both"/>
+      </w:pPr>
+      <w:r>
+        <w:rPr>
+          <w:rFonts w:ascii="Calibri" w:hAnsi="Calibri" w:cs="Calibri" w:eastAsia="Calibri"/>
+          <w:color w:val="111111"/>
+          <w:sz w:val="22"/>
+        </w:rPr>
+        <w:t>Both protocols are leakage-free: no quantity entering a forecast for a given day was computed from that day or later. They are not symmetric, though, and the asymmetry runs against the networks — the baselines absorb the out-of-sample period as it unfolds, the networks see none of it. A network that wins under this protocol wins conservatively; a network that loses in a state far from its training window cannot be told apart, on this evidence alone, from one whose training window has merely gone stale. Separating the two requires refitting the network at the baselines' cadence and comparing, a sensitivity this design admits rather than resolves, and which Chapter 4 reports.</w:t>
+      </w:r>
+    </w:p>
+    <w:p>
+      <w:pPr>
+        <w:spacing w:after="160" w:line="320" w:lineRule="auto"/>
+        <w:jc w:val="both"/>
+      </w:pPr>
+      <w:r>
+        <w:rPr>
+          <w:rFonts w:ascii="Calibri" w:hAnsi="Calibri" w:cs="Calibri" w:eastAsia="Calibri"/>
+          <w:color w:val="111111"/>
+          <w:sz w:val="22"/>
+        </w:rPr>
+        <w:t>The regime model's estimation window is shorter still. It is fitted on the training block alone — not on all pre-test data, as the networks are — and its posterior is then filtered forward without refitting. The reason is that those same rows carry a selection: the state count and the jump penalty of Section 3.3 are chosen on training data, so re-estimating the model afterwards would either reopen that choice or freeze it against a fit it no longer describes. Holding the estimation and selection windows identical is the conservative reading, and it means the regime signal available at any forecast origin was estimated from strictly less information than the network consuming it.</w:t>
       </w:r>
     </w:p>
     <w:p>

</xml_diff>